<commit_message>
Added base class 'GameObject', which other object classes now inherit from
</commit_message>
<xml_diff>
--- a/Project Document.docx
+++ b/Project Document.docx
@@ -8,6 +8,41 @@
         <w:rPr>
           <w:b/>
           <w:bCs/>
+          <w:color w:val="FFC000"/>
+          <w:sz w:val="52"/>
+          <w:szCs w:val="52"/>
+          <w:u w:val="single"/>
+        </w:rPr>
+      </w:pPr>
+      <w:r>
+        <w:rPr>
+          <w:b/>
+          <w:bCs/>
+          <w:color w:val="FFC000"/>
+          <w:sz w:val="52"/>
+          <w:szCs w:val="52"/>
+          <w:u w:val="single"/>
+        </w:rPr>
+        <w:t>Project Document</w:t>
+      </w:r>
+      <w:r>
+        <w:rPr>
+          <w:b/>
+          <w:bCs/>
+          <w:color w:val="FFC000"/>
+          <w:sz w:val="52"/>
+          <w:szCs w:val="52"/>
+          <w:u w:val="single"/>
+        </w:rPr>
+        <w:t>ation: Berkay Topal</w:t>
+      </w:r>
+    </w:p>
+    <w:p>
+      <w:pPr>
+        <w:rPr>
+          <w:b/>
+          <w:bCs/>
+          <w:color w:val="00B0F0"/>
           <w:sz w:val="40"/>
           <w:szCs w:val="40"/>
           <w:u w:val="single"/>
@@ -17,33 +52,1447 @@
         <w:rPr>
           <w:b/>
           <w:bCs/>
+          <w:color w:val="00B0F0"/>
           <w:sz w:val="40"/>
           <w:szCs w:val="40"/>
           <w:u w:val="single"/>
         </w:rPr>
-        <w:t>Project Document</w:t>
-      </w:r>
-    </w:p>
-    <w:p>
-      <w:r>
-        <w:rPr>
-          <w:b/>
-          <w:bCs/>
+        <w:t>Deliverable 1</w:t>
+      </w:r>
+    </w:p>
+    <w:p>
+      <w:pPr>
+        <w:rPr>
+          <w:sz w:val="30"/>
+          <w:szCs w:val="30"/>
+        </w:rPr>
+      </w:pPr>
+      <w:r>
+        <w:rPr>
+          <w:b/>
+          <w:bCs/>
+          <w:sz w:val="30"/>
+          <w:szCs w:val="30"/>
         </w:rPr>
         <w:t xml:space="preserve">Project Idea: </w:t>
       </w:r>
       <w:r>
+        <w:rPr>
+          <w:sz w:val="30"/>
+          <w:szCs w:val="30"/>
+        </w:rPr>
         <w:t>Brick Breaker / Arcade Game</w:t>
       </w:r>
+    </w:p>
+    <w:p>
+      <w:pPr>
+        <w:rPr>
+          <w:sz w:val="30"/>
+          <w:szCs w:val="30"/>
+        </w:rPr>
+      </w:pPr>
+      <w:r>
+        <w:rPr>
+          <w:b/>
+          <w:bCs/>
+          <w:sz w:val="30"/>
+          <w:szCs w:val="30"/>
+        </w:rPr>
+        <w:t>Title of Game</w:t>
+      </w:r>
+      <w:r>
+        <w:rPr>
+          <w:b/>
+          <w:bCs/>
+          <w:sz w:val="30"/>
+          <w:szCs w:val="30"/>
+        </w:rPr>
+        <w:t>:</w:t>
+      </w:r>
+      <w:r>
+        <w:rPr>
+          <w:sz w:val="30"/>
+          <w:szCs w:val="30"/>
+        </w:rPr>
+        <w:t xml:space="preserve"> </w:t>
+      </w:r>
+      <w:r>
+        <w:rPr>
+          <w:sz w:val="30"/>
+          <w:szCs w:val="30"/>
+        </w:rPr>
+        <w:t>Brick Blitz</w:t>
+      </w:r>
+    </w:p>
+    <w:p>
+      <w:pPr>
+        <w:rPr>
+          <w:b/>
+          <w:bCs/>
+          <w:u w:val="single"/>
+        </w:rPr>
+      </w:pPr>
+    </w:p>
+    <w:p>
+      <w:pPr>
+        <w:rPr>
+          <w:b/>
+          <w:bCs/>
+          <w:color w:val="00B050"/>
+          <w:u w:val="single"/>
+        </w:rPr>
+      </w:pPr>
+      <w:r>
+        <w:rPr>
+          <w:b/>
+          <w:bCs/>
+          <w:color w:val="00B050"/>
+          <w:u w:val="single"/>
+        </w:rPr>
+        <w:t>Brief Justification of Project Idea:</w:t>
+      </w:r>
+    </w:p>
+    <w:p>
+      <w:pPr>
+        <w:pStyle w:val="ListParagraph"/>
+        <w:numPr>
+          <w:ilvl w:val="0"/>
+          <w:numId w:val="1"/>
+        </w:numPr>
+        <w:rPr>
+          <w:b/>
+          <w:bCs/>
+          <w:u w:val="single"/>
+        </w:rPr>
+      </w:pPr>
+      <w:r>
+        <w:t xml:space="preserve">Brick breaker is </w:t>
+      </w:r>
+      <w:r>
+        <w:t>a game that everyone overlooks on how easy it is, but the mechanics behind it, I believe, is very complex</w:t>
+      </w:r>
+      <w:r>
+        <w:t>, and has a lot of room for scalability.</w:t>
+      </w:r>
+    </w:p>
+    <w:p>
+      <w:pPr>
+        <w:pStyle w:val="ListParagraph"/>
+        <w:numPr>
+          <w:ilvl w:val="1"/>
+          <w:numId w:val="1"/>
+        </w:numPr>
+        <w:rPr>
+          <w:b/>
+          <w:bCs/>
+          <w:u w:val="single"/>
+        </w:rPr>
+      </w:pPr>
+      <w:r>
+        <w:t>Hence want to prove that it is by making the game</w:t>
+      </w:r>
+    </w:p>
+    <w:p>
+      <w:pPr>
+        <w:pStyle w:val="ListParagraph"/>
+        <w:rPr>
+          <w:b/>
+          <w:bCs/>
+          <w:u w:val="single"/>
+        </w:rPr>
+      </w:pPr>
+    </w:p>
+    <w:p>
+      <w:pPr>
+        <w:pStyle w:val="ListParagraph"/>
+        <w:numPr>
+          <w:ilvl w:val="0"/>
+          <w:numId w:val="1"/>
+        </w:numPr>
+        <w:rPr>
+          <w:b/>
+          <w:bCs/>
+          <w:u w:val="single"/>
+        </w:rPr>
+      </w:pPr>
+      <w:r>
+        <w:t>The idea offers good balance of challenge</w:t>
+      </w:r>
+      <w:r>
+        <w:t xml:space="preserve"> and feasibility, where it is a project that I can get done comfortably by the due date</w:t>
+      </w:r>
+      <w:r>
+        <w:t>.</w:t>
+      </w:r>
+    </w:p>
+    <w:p>
+      <w:pPr>
+        <w:pStyle w:val="ListParagraph"/>
+        <w:rPr>
+          <w:b/>
+          <w:bCs/>
+          <w:u w:val="single"/>
+        </w:rPr>
+      </w:pPr>
+    </w:p>
+    <w:p>
+      <w:pPr>
+        <w:pStyle w:val="ListParagraph"/>
+        <w:numPr>
+          <w:ilvl w:val="0"/>
+          <w:numId w:val="1"/>
+        </w:numPr>
+        <w:rPr>
+          <w:b/>
+          <w:bCs/>
+          <w:u w:val="single"/>
+        </w:rPr>
+      </w:pPr>
+      <w:r>
+        <w:t>It is an idea easily scalable, where I can keep adding more and more ideas to it as I go on, it is not limited.</w:t>
+      </w:r>
+    </w:p>
+    <w:p>
+      <w:pPr>
+        <w:pStyle w:val="ListParagraph"/>
+        <w:rPr>
+          <w:b/>
+          <w:bCs/>
+          <w:u w:val="single"/>
+        </w:rPr>
+      </w:pPr>
+    </w:p>
+    <w:p>
+      <w:pPr>
+        <w:pStyle w:val="ListParagraph"/>
+        <w:numPr>
+          <w:ilvl w:val="0"/>
+          <w:numId w:val="1"/>
+        </w:numPr>
+        <w:rPr>
+          <w:b/>
+          <w:bCs/>
+          <w:u w:val="single"/>
+        </w:rPr>
+      </w:pPr>
+      <w:r>
+        <w:t>Finally, it offers the understanding of complex topics such as collision detection and physics-based movement, further expanding my knowledge</w:t>
+      </w:r>
+      <w:r>
+        <w:t>.</w:t>
+      </w:r>
+    </w:p>
+    <w:p>
+      <w:pPr>
+        <w:rPr>
+          <w:b/>
+          <w:bCs/>
+          <w:u w:val="single"/>
+        </w:rPr>
+      </w:pPr>
+    </w:p>
+    <w:p>
+      <w:pPr>
+        <w:rPr>
+          <w:b/>
+          <w:bCs/>
+          <w:color w:val="00B050"/>
+          <w:u w:val="single"/>
+        </w:rPr>
+      </w:pPr>
+      <w:r>
+        <w:rPr>
+          <w:b/>
+          <w:bCs/>
+          <w:color w:val="00B050"/>
+          <w:u w:val="single"/>
+        </w:rPr>
+        <w:t>Problem Definition:</w:t>
+      </w:r>
+    </w:p>
+    <w:p>
+      <w:pPr>
+        <w:pStyle w:val="ListParagraph"/>
+        <w:numPr>
+          <w:ilvl w:val="0"/>
+          <w:numId w:val="1"/>
+        </w:numPr>
+      </w:pPr>
+      <w:r>
+        <w:rPr>
+          <w:b/>
+          <w:bCs/>
+        </w:rPr>
+        <w:t xml:space="preserve">Problem: </w:t>
+      </w:r>
+      <w:r>
+        <w:t xml:space="preserve">Many arcade-style </w:t>
+      </w:r>
+      <w:r>
+        <w:t>games provide quick, engaging gameplay, but lack the modern implementations that improve the user experience</w:t>
+      </w:r>
+      <w:r>
+        <w:t>, and the ability for students &amp; developers to learn complex and simple gameplay mechanics</w:t>
+      </w:r>
+    </w:p>
+    <w:p>
+      <w:pPr>
+        <w:pStyle w:val="ListParagraph"/>
+      </w:pPr>
+    </w:p>
+    <w:p>
+      <w:pPr>
+        <w:pStyle w:val="ListParagraph"/>
+        <w:numPr>
+          <w:ilvl w:val="0"/>
+          <w:numId w:val="1"/>
+        </w:numPr>
+      </w:pPr>
+      <w:r>
+        <w:rPr>
+          <w:b/>
+          <w:bCs/>
+        </w:rPr>
+        <w:t xml:space="preserve">Idea: </w:t>
+      </w:r>
+      <w:r>
+        <w:t xml:space="preserve">Hence, with Brick Blitz I plan to develop a fun, interactive Brick Breaker game that challenges players’ reflexes, </w:t>
+      </w:r>
+      <w:r>
+        <w:t>allows students and developers to learn simple and complex gameplay mechanics, and overall provide a rewarding experience</w:t>
+      </w:r>
+    </w:p>
+    <w:p/>
+    <w:p>
+      <w:pPr>
+        <w:rPr>
+          <w:b/>
+          <w:bCs/>
+          <w:u w:val="single"/>
+        </w:rPr>
+      </w:pPr>
+    </w:p>
+    <w:p>
+      <w:pPr>
+        <w:rPr>
+          <w:b/>
+          <w:bCs/>
+          <w:color w:val="00B050"/>
+          <w:u w:val="single"/>
+        </w:rPr>
+      </w:pPr>
+      <w:r>
+        <w:rPr>
+          <w:b/>
+          <w:bCs/>
+          <w:color w:val="00B050"/>
+          <w:u w:val="single"/>
+        </w:rPr>
+        <w:t>Target Audience:</w:t>
+      </w:r>
+    </w:p>
+    <w:p>
+      <w:pPr>
+        <w:pStyle w:val="ListParagraph"/>
+        <w:numPr>
+          <w:ilvl w:val="0"/>
+          <w:numId w:val="1"/>
+        </w:numPr>
+      </w:pPr>
+      <w:r>
+        <w:t>Casual gamers who enjoy classic arcade-style games</w:t>
+      </w:r>
+    </w:p>
+    <w:p>
+      <w:pPr>
+        <w:pStyle w:val="ListParagraph"/>
+      </w:pPr>
+    </w:p>
+    <w:p>
+      <w:pPr>
+        <w:pStyle w:val="ListParagraph"/>
+        <w:numPr>
+          <w:ilvl w:val="0"/>
+          <w:numId w:val="1"/>
+        </w:numPr>
+      </w:pPr>
+      <w:r>
+        <w:t xml:space="preserve">Students and developers interested in learning about game development, particularly collision detection, physics-based movement, and event handling in </w:t>
+      </w:r>
+      <w:proofErr w:type="spellStart"/>
+      <w:r>
+        <w:t>Pygame</w:t>
+      </w:r>
+      <w:proofErr w:type="spellEnd"/>
+    </w:p>
+    <w:p>
+      <w:pPr>
+        <w:pStyle w:val="ListParagraph"/>
+      </w:pPr>
+    </w:p>
+    <w:p>
+      <w:pPr>
+        <w:pStyle w:val="ListParagraph"/>
+        <w:numPr>
+          <w:ilvl w:val="0"/>
+          <w:numId w:val="1"/>
+        </w:numPr>
+      </w:pPr>
+      <w:r>
+        <w:t>Game controls are simple and easy, so users of all ages allowed to play, but mainly targeting younger generation who more commonly play games</w:t>
+      </w:r>
+    </w:p>
+    <w:p>
+      <w:pPr>
+        <w:pStyle w:val="ListParagraph"/>
+      </w:pPr>
+    </w:p>
+    <w:p/>
+    <w:p>
+      <w:pPr>
+        <w:rPr>
+          <w:b/>
+          <w:bCs/>
+          <w:color w:val="00B050"/>
+          <w:u w:val="single"/>
+        </w:rPr>
+      </w:pPr>
+      <w:r>
+        <w:rPr>
+          <w:b/>
+          <w:bCs/>
+          <w:color w:val="00B050"/>
+          <w:u w:val="single"/>
+        </w:rPr>
+        <w:t>Objectives:</w:t>
+      </w:r>
+    </w:p>
+    <w:p>
+      <w:pPr>
+        <w:rPr>
+          <w:b/>
+          <w:bCs/>
+          <w:color w:val="00B050"/>
+          <w:u w:val="single"/>
+        </w:rPr>
+      </w:pPr>
+      <w:r>
+        <w:rPr>
+          <w:color w:val="FF0000"/>
+        </w:rPr>
+        <w:t>Main Objectives:</w:t>
+      </w:r>
+    </w:p>
+    <w:p>
+      <w:pPr>
+        <w:pStyle w:val="ListParagraph"/>
+        <w:numPr>
+          <w:ilvl w:val="0"/>
+          <w:numId w:val="1"/>
+        </w:numPr>
+      </w:pPr>
+      <w:r>
+        <w:lastRenderedPageBreak/>
+        <w:t>Develop a fully playable Brick Breaker game, with core mechanics (</w:t>
+      </w:r>
+      <w:proofErr w:type="spellStart"/>
+      <w:r>
+        <w:t>Eg.</w:t>
+      </w:r>
+      <w:proofErr w:type="spellEnd"/>
+      <w:r>
+        <w:t xml:space="preserve"> Ball movement, paddle control, brick-breaking</w:t>
+      </w:r>
+      <w:r>
+        <w:t>, etc.</w:t>
+      </w:r>
+      <w:r>
+        <w:t xml:space="preserve">), </w:t>
+      </w:r>
+      <w:r>
+        <w:t>and side mechanics (</w:t>
+      </w:r>
+      <w:proofErr w:type="spellStart"/>
+      <w:r>
+        <w:t>Eg.</w:t>
+      </w:r>
+      <w:proofErr w:type="spellEnd"/>
+      <w:r>
+        <w:t xml:space="preserve"> Menu, Sound, </w:t>
+      </w:r>
+      <w:r>
+        <w:t xml:space="preserve">Directional Control, Levels, etc.) </w:t>
+      </w:r>
+      <w:r>
+        <w:t xml:space="preserve">that is better than </w:t>
+      </w:r>
+      <w:proofErr w:type="spellStart"/>
+      <w:r>
+        <w:t>Arkanoid</w:t>
+      </w:r>
+      <w:proofErr w:type="spellEnd"/>
+      <w:r>
+        <w:t>.</w:t>
+      </w:r>
+    </w:p>
+    <w:p>
+      <w:pPr>
+        <w:pStyle w:val="ListParagraph"/>
+      </w:pPr>
+    </w:p>
+    <w:p>
+      <w:pPr>
+        <w:rPr>
+          <w:color w:val="FF0000"/>
+        </w:rPr>
+      </w:pPr>
+      <w:r>
+        <w:rPr>
+          <w:color w:val="FF0000"/>
+        </w:rPr>
+        <w:t>Sub-Objectives:</w:t>
+      </w:r>
+    </w:p>
+    <w:p>
+      <w:pPr>
+        <w:pStyle w:val="ListParagraph"/>
+        <w:numPr>
+          <w:ilvl w:val="0"/>
+          <w:numId w:val="5"/>
+        </w:numPr>
+        <w:ind w:left="720"/>
+      </w:pPr>
+      <w:r>
+        <w:t>Implement collision detection between ball, paddle, bricks</w:t>
+      </w:r>
+    </w:p>
+    <w:p>
+      <w:pPr>
+        <w:pStyle w:val="ListParagraph"/>
+      </w:pPr>
+    </w:p>
+    <w:p>
+      <w:pPr>
+        <w:pStyle w:val="ListParagraph"/>
+        <w:numPr>
+          <w:ilvl w:val="0"/>
+          <w:numId w:val="5"/>
+        </w:numPr>
+        <w:ind w:left="720"/>
+      </w:pPr>
+      <w:r>
+        <w:t>Design progressive difficulty, where it has multiple levels with increasing challenges</w:t>
+      </w:r>
+    </w:p>
+    <w:p>
+      <w:pPr>
+        <w:pStyle w:val="ListParagraph"/>
+        <w:ind w:left="0"/>
+      </w:pPr>
+    </w:p>
+    <w:p>
+      <w:pPr>
+        <w:pStyle w:val="ListParagraph"/>
+        <w:numPr>
+          <w:ilvl w:val="0"/>
+          <w:numId w:val="5"/>
+        </w:numPr>
+        <w:ind w:left="720"/>
+      </w:pPr>
+      <w:r>
+        <w:t xml:space="preserve">Make power-ups &amp; other mechanics to enhance gameplay </w:t>
+      </w:r>
+    </w:p>
+    <w:p>
+      <w:pPr>
+        <w:pStyle w:val="ListParagraph"/>
+        <w:ind w:left="0"/>
+      </w:pPr>
+    </w:p>
+    <w:p>
+      <w:pPr>
+        <w:pStyle w:val="ListParagraph"/>
+        <w:numPr>
+          <w:ilvl w:val="0"/>
+          <w:numId w:val="5"/>
+        </w:numPr>
+        <w:ind w:left="720"/>
+      </w:pPr>
+      <w:r>
+        <w:t>Ensure smooth performance, efficient use of memory, and user-friendly control</w:t>
+      </w:r>
+    </w:p>
+    <w:p>
+      <w:pPr>
+        <w:pStyle w:val="ListParagraph"/>
+      </w:pPr>
+    </w:p>
+    <w:p>
+      <w:pPr>
+        <w:pStyle w:val="ListParagraph"/>
+        <w:numPr>
+          <w:ilvl w:val="0"/>
+          <w:numId w:val="5"/>
+        </w:numPr>
+        <w:ind w:left="720"/>
+      </w:pPr>
+      <w:r>
+        <w:t>Make clear and aesthetic “Game Over” and “Win” conditions/screens, with menus and such allowing players to start / restart the game</w:t>
+      </w:r>
+    </w:p>
+    <w:p>
+      <w:pPr>
+        <w:pStyle w:val="ListParagraph"/>
+      </w:pPr>
+    </w:p>
+    <w:p>
+      <w:pPr>
+        <w:pStyle w:val="ListParagraph"/>
+        <w:rPr>
+          <w:color w:val="FF0000"/>
+        </w:rPr>
+      </w:pPr>
+    </w:p>
+    <w:p/>
+    <w:p/>
+    <w:p>
+      <w:pPr>
+        <w:rPr>
+          <w:b/>
+          <w:bCs/>
+          <w:color w:val="00B050"/>
+          <w:u w:val="single"/>
+        </w:rPr>
+      </w:pPr>
+      <w:r>
+        <w:rPr>
+          <w:b/>
+          <w:bCs/>
+          <w:color w:val="00B050"/>
+          <w:u w:val="single"/>
+        </w:rPr>
+        <w:t>Initial Design of Program</w:t>
+      </w:r>
+      <w:r>
+        <w:rPr>
+          <w:b/>
+          <w:bCs/>
+          <w:color w:val="00B050"/>
+          <w:u w:val="single"/>
+        </w:rPr>
+        <w:t xml:space="preserve"> (Different Screens)</w:t>
+      </w:r>
+      <w:r>
+        <w:rPr>
+          <w:b/>
+          <w:bCs/>
+          <w:color w:val="00B050"/>
+          <w:u w:val="single"/>
+        </w:rPr>
+        <w:t>:</w:t>
+      </w:r>
+    </w:p>
+    <w:p>
+      <w:pPr>
+        <w:rPr>
+          <w:b/>
+          <w:bCs/>
+          <w:color w:val="7030A0"/>
+        </w:rPr>
+      </w:pPr>
+      <w:r>
+        <w:rPr>
+          <w:b/>
+          <w:bCs/>
+          <w:color w:val="7030A0"/>
+        </w:rPr>
+        <w:t>Start Screen:</w:t>
+      </w:r>
+    </w:p>
+    <w:p>
+      <w:pPr>
+        <w:pStyle w:val="ListParagraph"/>
+        <w:numPr>
+          <w:ilvl w:val="0"/>
+          <w:numId w:val="1"/>
+        </w:numPr>
+      </w:pPr>
+      <w:r>
+        <w:t>Will start game with main menu</w:t>
+      </w:r>
+      <w:r>
+        <w:t>, has:</w:t>
+      </w:r>
+    </w:p>
+    <w:p>
+      <w:pPr>
+        <w:pStyle w:val="ListParagraph"/>
+        <w:numPr>
+          <w:ilvl w:val="1"/>
+          <w:numId w:val="1"/>
+        </w:numPr>
+      </w:pPr>
+      <w:r>
+        <w:t>Title, “Start Game” button, “Instructions” button, “</w:t>
+      </w:r>
+      <w:r>
+        <w:t>Volume</w:t>
+      </w:r>
+      <w:r>
+        <w:t>” button, “Quit” button</w:t>
+      </w:r>
+    </w:p>
+    <w:p>
+      <w:pPr>
+        <w:pStyle w:val="ListParagraph"/>
+      </w:pPr>
+    </w:p>
+    <w:p>
+      <w:pPr>
+        <w:pStyle w:val="ListParagraph"/>
+      </w:pPr>
+      <w:r>
+        <w:rPr>
+          <w:noProof/>
+        </w:rPr>
+        <w:drawing>
+          <wp:inline distT="0" distB="0" distL="0" distR="0" wp14:anchorId="43344B22" wp14:editId="21CE3C08">
+            <wp:extent cx="1371834" cy="2162175"/>
+            <wp:effectExtent l="0" t="0" r="0" b="0"/>
+            <wp:docPr id="971906211" name="Picture 1" descr="A screen shot of a black board&#10;&#10;AI-generated content may be incorrect."/>
+            <wp:cNvGraphicFramePr>
+              <a:graphicFrameLocks xmlns:a="http://schemas.openxmlformats.org/drawingml/2006/main" noChangeAspect="1"/>
+            </wp:cNvGraphicFramePr>
+            <a:graphic xmlns:a="http://schemas.openxmlformats.org/drawingml/2006/main">
+              <a:graphicData uri="http://schemas.openxmlformats.org/drawingml/2006/picture">
+                <pic:pic xmlns:pic="http://schemas.openxmlformats.org/drawingml/2006/picture">
+                  <pic:nvPicPr>
+                    <pic:cNvPr id="971906211" name="Picture 1" descr="A screen shot of a black board&#10;&#10;AI-generated content may be incorrect."/>
+                    <pic:cNvPicPr/>
+                  </pic:nvPicPr>
+                  <pic:blipFill>
+                    <a:blip r:embed="rId5"/>
+                    <a:stretch>
+                      <a:fillRect/>
+                    </a:stretch>
+                  </pic:blipFill>
+                  <pic:spPr>
+                    <a:xfrm>
+                      <a:off x="0" y="0"/>
+                      <a:ext cx="1375055" cy="2167251"/>
+                    </a:xfrm>
+                    <a:prstGeom prst="rect">
+                      <a:avLst/>
+                    </a:prstGeom>
+                  </pic:spPr>
+                </pic:pic>
+              </a:graphicData>
+            </a:graphic>
+          </wp:inline>
+        </w:drawing>
+      </w:r>
+    </w:p>
+    <w:p/>
+    <w:p/>
+    <w:p/>
+    <w:p>
+      <w:pPr>
+        <w:rPr>
+          <w:b/>
+          <w:bCs/>
+          <w:color w:val="7030A0"/>
+        </w:rPr>
+      </w:pPr>
+      <w:r>
+        <w:rPr>
+          <w:b/>
+          <w:bCs/>
+          <w:color w:val="7030A0"/>
+        </w:rPr>
+        <w:t>Game Screen:</w:t>
+      </w:r>
+    </w:p>
+    <w:p>
+      <w:pPr>
+        <w:pStyle w:val="ListParagraph"/>
+        <w:numPr>
+          <w:ilvl w:val="0"/>
+          <w:numId w:val="1"/>
+        </w:numPr>
+      </w:pPr>
+      <w:r>
+        <w:t>Has paddle, ball, bricks</w:t>
+      </w:r>
+    </w:p>
+    <w:p>
+      <w:pPr>
+        <w:pStyle w:val="ListParagraph"/>
+      </w:pPr>
+    </w:p>
+    <w:p>
+      <w:pPr>
+        <w:pStyle w:val="ListParagraph"/>
+        <w:numPr>
+          <w:ilvl w:val="0"/>
+          <w:numId w:val="1"/>
+        </w:numPr>
+      </w:pPr>
+      <w:r>
+        <w:t>Scoring system</w:t>
+      </w:r>
+    </w:p>
+    <w:p>
+      <w:pPr>
+        <w:pStyle w:val="ListParagraph"/>
+      </w:pPr>
+    </w:p>
+    <w:p>
+      <w:pPr>
+        <w:pStyle w:val="ListParagraph"/>
+      </w:pPr>
+      <w:r>
+        <w:rPr>
+          <w:noProof/>
+        </w:rPr>
+        <w:lastRenderedPageBreak/>
+        <w:drawing>
+          <wp:inline distT="0" distB="0" distL="0" distR="0" wp14:anchorId="59B0F37E" wp14:editId="75F36ECC">
+            <wp:extent cx="1905000" cy="2044390"/>
+            <wp:effectExtent l="0" t="0" r="0" b="0"/>
+            <wp:docPr id="912142158" name="Picture 1" descr="A screen shot of a game&#10;&#10;AI-generated content may be incorrect."/>
+            <wp:cNvGraphicFramePr>
+              <a:graphicFrameLocks xmlns:a="http://schemas.openxmlformats.org/drawingml/2006/main" noChangeAspect="1"/>
+            </wp:cNvGraphicFramePr>
+            <a:graphic xmlns:a="http://schemas.openxmlformats.org/drawingml/2006/main">
+              <a:graphicData uri="http://schemas.openxmlformats.org/drawingml/2006/picture">
+                <pic:pic xmlns:pic="http://schemas.openxmlformats.org/drawingml/2006/picture">
+                  <pic:nvPicPr>
+                    <pic:cNvPr id="912142158" name="Picture 1" descr="A screen shot of a game&#10;&#10;AI-generated content may be incorrect."/>
+                    <pic:cNvPicPr/>
+                  </pic:nvPicPr>
+                  <pic:blipFill>
+                    <a:blip r:embed="rId6"/>
+                    <a:stretch>
+                      <a:fillRect/>
+                    </a:stretch>
+                  </pic:blipFill>
+                  <pic:spPr>
+                    <a:xfrm>
+                      <a:off x="0" y="0"/>
+                      <a:ext cx="1909362" cy="2049071"/>
+                    </a:xfrm>
+                    <a:prstGeom prst="rect">
+                      <a:avLst/>
+                    </a:prstGeom>
+                  </pic:spPr>
+                </pic:pic>
+              </a:graphicData>
+            </a:graphic>
+          </wp:inline>
+        </w:drawing>
+      </w:r>
+    </w:p>
+    <w:p/>
+    <w:p/>
+    <w:p/>
+    <w:p/>
+    <w:p>
+      <w:pPr>
+        <w:rPr>
+          <w:b/>
+          <w:bCs/>
+          <w:color w:val="7030A0"/>
+        </w:rPr>
+      </w:pPr>
+      <w:r>
+        <w:rPr>
+          <w:b/>
+          <w:bCs/>
+          <w:color w:val="7030A0"/>
+        </w:rPr>
+        <w:t>Game Over Screen:</w:t>
+      </w:r>
+    </w:p>
+    <w:p>
+      <w:pPr>
+        <w:pStyle w:val="ListParagraph"/>
+        <w:numPr>
+          <w:ilvl w:val="0"/>
+          <w:numId w:val="1"/>
+        </w:numPr>
+      </w:pPr>
+      <w:r>
+        <w:t>Has game over message, final score and “Main Menu” button</w:t>
+      </w:r>
+    </w:p>
+    <w:p/>
+    <w:p>
+      <w:r>
+        <w:t xml:space="preserve"> </w:t>
+      </w:r>
+      <w:r>
+        <w:rPr>
+          <w:noProof/>
+        </w:rPr>
+        <w:drawing>
+          <wp:inline distT="0" distB="0" distL="0" distR="0" wp14:anchorId="4C6B8A22" wp14:editId="759E93C3">
+            <wp:extent cx="4200525" cy="2906975"/>
+            <wp:effectExtent l="0" t="0" r="0" b="8255"/>
+            <wp:docPr id="855972217" name="Picture 1" descr="A screen shot of a game&#10;&#10;AI-generated content may be incorrect."/>
+            <wp:cNvGraphicFramePr>
+              <a:graphicFrameLocks xmlns:a="http://schemas.openxmlformats.org/drawingml/2006/main" noChangeAspect="1"/>
+            </wp:cNvGraphicFramePr>
+            <a:graphic xmlns:a="http://schemas.openxmlformats.org/drawingml/2006/main">
+              <a:graphicData uri="http://schemas.openxmlformats.org/drawingml/2006/picture">
+                <pic:pic xmlns:pic="http://schemas.openxmlformats.org/drawingml/2006/picture">
+                  <pic:nvPicPr>
+                    <pic:cNvPr id="855972217" name="Picture 1" descr="A screen shot of a game&#10;&#10;AI-generated content may be incorrect."/>
+                    <pic:cNvPicPr/>
+                  </pic:nvPicPr>
+                  <pic:blipFill>
+                    <a:blip r:embed="rId7"/>
+                    <a:stretch>
+                      <a:fillRect/>
+                    </a:stretch>
+                  </pic:blipFill>
+                  <pic:spPr>
+                    <a:xfrm>
+                      <a:off x="0" y="0"/>
+                      <a:ext cx="4204891" cy="2909997"/>
+                    </a:xfrm>
+                    <a:prstGeom prst="rect">
+                      <a:avLst/>
+                    </a:prstGeom>
+                  </pic:spPr>
+                </pic:pic>
+              </a:graphicData>
+            </a:graphic>
+          </wp:inline>
+        </w:drawing>
+      </w:r>
+    </w:p>
+    <w:p/>
+    <w:p>
+      <w:pPr>
+        <w:rPr>
+          <w:b/>
+          <w:bCs/>
+          <w:color w:val="7030A0"/>
+        </w:rPr>
+      </w:pPr>
+    </w:p>
+    <w:p>
+      <w:pPr>
+        <w:rPr>
+          <w:b/>
+          <w:bCs/>
+          <w:color w:val="7030A0"/>
+        </w:rPr>
+      </w:pPr>
+    </w:p>
+    <w:p>
+      <w:pPr>
+        <w:rPr>
+          <w:color w:val="7030A0"/>
+        </w:rPr>
+      </w:pPr>
     </w:p>
     <w:sectPr>
       <w:pgSz w:w="11906" w:h="16838"/>
-      <w:pgMar w:top="1440" w:right="1440" w:bottom="1440" w:left="1440" w:header="708" w:footer="708" w:gutter="0"/>
+      <w:pgMar w:top="720" w:right="720" w:bottom="720" w:left="720" w:header="708" w:footer="708" w:gutter="0"/>
       <w:cols w:space="708"/>
       <w:docGrid w:linePitch="360"/>
     </w:sectPr>
   </w:body>
 </w:document>
+</file>
+
+<file path=word/numbering.xml><?xml version="1.0" encoding="utf-8"?>
+<w:numbering xmlns:wpc="http://schemas.microsoft.com/office/word/2010/wordprocessingCanvas" xmlns:cx="http://schemas.microsoft.com/office/drawing/2014/chartex" xmlns:cx1="http://schemas.microsoft.com/office/drawing/2015/9/8/chartex" xmlns:cx2="http://schemas.microsoft.com/office/drawing/2015/10/21/chartex" xmlns:cx3="http://schemas.microsoft.com/office/drawing/2016/5/9/chartex" xmlns:cx4="http://schemas.microsoft.com/office/drawing/2016/5/10/chartex" xmlns:cx5="http://schemas.microsoft.com/office/drawing/2016/5/11/chartex" xmlns:cx6="http://schemas.microsoft.com/office/drawing/2016/5/12/chartex" xmlns:cx7="http://schemas.microsoft.com/office/drawing/2016/5/13/chartex" xmlns:cx8="http://schemas.microsoft.com/office/drawing/2016/5/14/chartex" xmlns:mc="http://schemas.openxmlformats.org/markup-compatibility/2006" xmlns:aink="http://schemas.microsoft.com/office/drawing/2016/ink" xmlns:am3d="http://schemas.microsoft.com/office/drawing/2017/model3d" xmlns:o="urn:schemas-microsoft-com:office:office" xmlns:oel="http://schemas.microsoft.com/office/2019/extlst" xmlns:r="http://schemas.openxmlformats.org/officeDocument/2006/relationships" xmlns:m="http://schemas.openxmlformats.org/officeDocument/2006/math" xmlns:v="urn:schemas-microsoft-com:vml" xmlns:wp14="http://schemas.microsoft.com/office/word/2010/wordprocessingDrawing" xmlns:wp="http://schemas.openxmlformats.org/drawingml/2006/wordprocessingDrawing" xmlns:w10="urn:schemas-microsoft-com:office:word" xmlns:w="http://schemas.openxmlformats.org/wordprocessingml/2006/main" xmlns:w14="http://schemas.microsoft.com/office/word/2010/wordml" xmlns:w15="http://schemas.microsoft.com/office/word/2012/wordml" xmlns:w16cex="http://schemas.microsoft.com/office/word/2018/wordml/cex" xmlns:w16cid="http://schemas.microsoft.com/office/word/2016/wordml/cid" xmlns:w16="http://schemas.microsoft.com/office/word/2018/wordml" xmlns:w16du="http://schemas.microsoft.com/office/word/2023/wordml/word16du" xmlns:w16sdtdh="http://schemas.microsoft.com/office/word/2020/wordml/sdtdatahash" xmlns:w16sdtfl="http://schemas.microsoft.com/office/word/2024/wordml/sdtformatlock" xmlns:w16se="http://schemas.microsoft.com/office/word/2015/wordml/symex" xmlns:wpg="http://schemas.microsoft.com/office/word/2010/wordprocessingGroup" xmlns:wpi="http://schemas.microsoft.com/office/word/2010/wordprocessingInk" xmlns:wne="http://schemas.microsoft.com/office/word/2006/wordml" xmlns:wps="http://schemas.microsoft.com/office/word/2010/wordprocessingShape" mc:Ignorable="w14 w15 w16se w16cid w16 w16cex w16sdtdh w16sdtfl w16du wp14">
+  <w:abstractNum w:abstractNumId="0" w15:restartNumberingAfterBreak="0">
+    <w:nsid w:val="02A3583D"/>
+    <w:multiLevelType w:val="hybridMultilevel"/>
+    <w:tmpl w:val="E5AA28CC"/>
+    <w:lvl w:ilvl="0" w:tplc="7F704B0E">
+      <w:numFmt w:val="bullet"/>
+      <w:lvlText w:val="-"/>
+      <w:lvlJc w:val="left"/>
+      <w:pPr>
+        <w:ind w:left="720" w:hanging="360"/>
+      </w:pPr>
+      <w:rPr>
+        <w:rFonts w:ascii="Aptos" w:eastAsiaTheme="minorHAnsi" w:hAnsi="Aptos" w:cstheme="minorBidi" w:hint="default"/>
+      </w:rPr>
+    </w:lvl>
+    <w:lvl w:ilvl="1" w:tplc="0C090003">
+      <w:start w:val="1"/>
+      <w:numFmt w:val="bullet"/>
+      <w:lvlText w:val="o"/>
+      <w:lvlJc w:val="left"/>
+      <w:pPr>
+        <w:ind w:left="1440" w:hanging="360"/>
+      </w:pPr>
+      <w:rPr>
+        <w:rFonts w:ascii="Courier New" w:hAnsi="Courier New" w:cs="Courier New" w:hint="default"/>
+      </w:rPr>
+    </w:lvl>
+    <w:lvl w:ilvl="2" w:tplc="0C090005" w:tentative="1">
+      <w:start w:val="1"/>
+      <w:numFmt w:val="bullet"/>
+      <w:lvlText w:val=""/>
+      <w:lvlJc w:val="left"/>
+      <w:pPr>
+        <w:ind w:left="2160" w:hanging="360"/>
+      </w:pPr>
+      <w:rPr>
+        <w:rFonts w:ascii="Wingdings" w:hAnsi="Wingdings" w:hint="default"/>
+      </w:rPr>
+    </w:lvl>
+    <w:lvl w:ilvl="3" w:tplc="0C090001" w:tentative="1">
+      <w:start w:val="1"/>
+      <w:numFmt w:val="bullet"/>
+      <w:lvlText w:val=""/>
+      <w:lvlJc w:val="left"/>
+      <w:pPr>
+        <w:ind w:left="2880" w:hanging="360"/>
+      </w:pPr>
+      <w:rPr>
+        <w:rFonts w:ascii="Symbol" w:hAnsi="Symbol" w:hint="default"/>
+      </w:rPr>
+    </w:lvl>
+    <w:lvl w:ilvl="4" w:tplc="0C090003" w:tentative="1">
+      <w:start w:val="1"/>
+      <w:numFmt w:val="bullet"/>
+      <w:lvlText w:val="o"/>
+      <w:lvlJc w:val="left"/>
+      <w:pPr>
+        <w:ind w:left="3600" w:hanging="360"/>
+      </w:pPr>
+      <w:rPr>
+        <w:rFonts w:ascii="Courier New" w:hAnsi="Courier New" w:cs="Courier New" w:hint="default"/>
+      </w:rPr>
+    </w:lvl>
+    <w:lvl w:ilvl="5" w:tplc="0C090005" w:tentative="1">
+      <w:start w:val="1"/>
+      <w:numFmt w:val="bullet"/>
+      <w:lvlText w:val=""/>
+      <w:lvlJc w:val="left"/>
+      <w:pPr>
+        <w:ind w:left="4320" w:hanging="360"/>
+      </w:pPr>
+      <w:rPr>
+        <w:rFonts w:ascii="Wingdings" w:hAnsi="Wingdings" w:hint="default"/>
+      </w:rPr>
+    </w:lvl>
+    <w:lvl w:ilvl="6" w:tplc="0C090001" w:tentative="1">
+      <w:start w:val="1"/>
+      <w:numFmt w:val="bullet"/>
+      <w:lvlText w:val=""/>
+      <w:lvlJc w:val="left"/>
+      <w:pPr>
+        <w:ind w:left="5040" w:hanging="360"/>
+      </w:pPr>
+      <w:rPr>
+        <w:rFonts w:ascii="Symbol" w:hAnsi="Symbol" w:hint="default"/>
+      </w:rPr>
+    </w:lvl>
+    <w:lvl w:ilvl="7" w:tplc="0C090003" w:tentative="1">
+      <w:start w:val="1"/>
+      <w:numFmt w:val="bullet"/>
+      <w:lvlText w:val="o"/>
+      <w:lvlJc w:val="left"/>
+      <w:pPr>
+        <w:ind w:left="5760" w:hanging="360"/>
+      </w:pPr>
+      <w:rPr>
+        <w:rFonts w:ascii="Courier New" w:hAnsi="Courier New" w:cs="Courier New" w:hint="default"/>
+      </w:rPr>
+    </w:lvl>
+    <w:lvl w:ilvl="8" w:tplc="0C090005" w:tentative="1">
+      <w:start w:val="1"/>
+      <w:numFmt w:val="bullet"/>
+      <w:lvlText w:val=""/>
+      <w:lvlJc w:val="left"/>
+      <w:pPr>
+        <w:ind w:left="6480" w:hanging="360"/>
+      </w:pPr>
+      <w:rPr>
+        <w:rFonts w:ascii="Wingdings" w:hAnsi="Wingdings" w:hint="default"/>
+      </w:rPr>
+    </w:lvl>
+  </w:abstractNum>
+  <w:abstractNum w:abstractNumId="1" w15:restartNumberingAfterBreak="0">
+    <w:nsid w:val="1A167BEF"/>
+    <w:multiLevelType w:val="hybridMultilevel"/>
+    <w:tmpl w:val="0192AAB4"/>
+    <w:lvl w:ilvl="0" w:tplc="E430A74E">
+      <w:start w:val="1"/>
+      <w:numFmt w:val="decimal"/>
+      <w:lvlText w:val="%1)"/>
+      <w:lvlJc w:val="left"/>
+      <w:pPr>
+        <w:ind w:left="1080" w:hanging="360"/>
+      </w:pPr>
+      <w:rPr>
+        <w:rFonts w:hint="default"/>
+      </w:rPr>
+    </w:lvl>
+    <w:lvl w:ilvl="1" w:tplc="0C090019" w:tentative="1">
+      <w:start w:val="1"/>
+      <w:numFmt w:val="lowerLetter"/>
+      <w:lvlText w:val="%2."/>
+      <w:lvlJc w:val="left"/>
+      <w:pPr>
+        <w:ind w:left="1800" w:hanging="360"/>
+      </w:pPr>
+    </w:lvl>
+    <w:lvl w:ilvl="2" w:tplc="0C09001B" w:tentative="1">
+      <w:start w:val="1"/>
+      <w:numFmt w:val="lowerRoman"/>
+      <w:lvlText w:val="%3."/>
+      <w:lvlJc w:val="right"/>
+      <w:pPr>
+        <w:ind w:left="2520" w:hanging="180"/>
+      </w:pPr>
+    </w:lvl>
+    <w:lvl w:ilvl="3" w:tplc="0C09000F" w:tentative="1">
+      <w:start w:val="1"/>
+      <w:numFmt w:val="decimal"/>
+      <w:lvlText w:val="%4."/>
+      <w:lvlJc w:val="left"/>
+      <w:pPr>
+        <w:ind w:left="3240" w:hanging="360"/>
+      </w:pPr>
+    </w:lvl>
+    <w:lvl w:ilvl="4" w:tplc="0C090019" w:tentative="1">
+      <w:start w:val="1"/>
+      <w:numFmt w:val="lowerLetter"/>
+      <w:lvlText w:val="%5."/>
+      <w:lvlJc w:val="left"/>
+      <w:pPr>
+        <w:ind w:left="3960" w:hanging="360"/>
+      </w:pPr>
+    </w:lvl>
+    <w:lvl w:ilvl="5" w:tplc="0C09001B" w:tentative="1">
+      <w:start w:val="1"/>
+      <w:numFmt w:val="lowerRoman"/>
+      <w:lvlText w:val="%6."/>
+      <w:lvlJc w:val="right"/>
+      <w:pPr>
+        <w:ind w:left="4680" w:hanging="180"/>
+      </w:pPr>
+    </w:lvl>
+    <w:lvl w:ilvl="6" w:tplc="0C09000F" w:tentative="1">
+      <w:start w:val="1"/>
+      <w:numFmt w:val="decimal"/>
+      <w:lvlText w:val="%7."/>
+      <w:lvlJc w:val="left"/>
+      <w:pPr>
+        <w:ind w:left="5400" w:hanging="360"/>
+      </w:pPr>
+    </w:lvl>
+    <w:lvl w:ilvl="7" w:tplc="0C090019" w:tentative="1">
+      <w:start w:val="1"/>
+      <w:numFmt w:val="lowerLetter"/>
+      <w:lvlText w:val="%8."/>
+      <w:lvlJc w:val="left"/>
+      <w:pPr>
+        <w:ind w:left="6120" w:hanging="360"/>
+      </w:pPr>
+    </w:lvl>
+    <w:lvl w:ilvl="8" w:tplc="0C09001B" w:tentative="1">
+      <w:start w:val="1"/>
+      <w:numFmt w:val="lowerRoman"/>
+      <w:lvlText w:val="%9."/>
+      <w:lvlJc w:val="right"/>
+      <w:pPr>
+        <w:ind w:left="6840" w:hanging="180"/>
+      </w:pPr>
+    </w:lvl>
+  </w:abstractNum>
+  <w:abstractNum w:abstractNumId="2" w15:restartNumberingAfterBreak="0">
+    <w:nsid w:val="46637D20"/>
+    <w:multiLevelType w:val="hybridMultilevel"/>
+    <w:tmpl w:val="9B78E758"/>
+    <w:lvl w:ilvl="0" w:tplc="0C090011">
+      <w:start w:val="1"/>
+      <w:numFmt w:val="decimal"/>
+      <w:lvlText w:val="%1)"/>
+      <w:lvlJc w:val="left"/>
+      <w:pPr>
+        <w:ind w:left="360" w:hanging="360"/>
+      </w:pPr>
+      <w:rPr>
+        <w:rFonts w:hint="default"/>
+      </w:rPr>
+    </w:lvl>
+    <w:lvl w:ilvl="1" w:tplc="0C090019" w:tentative="1">
+      <w:start w:val="1"/>
+      <w:numFmt w:val="lowerLetter"/>
+      <w:lvlText w:val="%2."/>
+      <w:lvlJc w:val="left"/>
+      <w:pPr>
+        <w:ind w:left="1080" w:hanging="360"/>
+      </w:pPr>
+    </w:lvl>
+    <w:lvl w:ilvl="2" w:tplc="0C09001B" w:tentative="1">
+      <w:start w:val="1"/>
+      <w:numFmt w:val="lowerRoman"/>
+      <w:lvlText w:val="%3."/>
+      <w:lvlJc w:val="right"/>
+      <w:pPr>
+        <w:ind w:left="1800" w:hanging="180"/>
+      </w:pPr>
+    </w:lvl>
+    <w:lvl w:ilvl="3" w:tplc="0C09000F" w:tentative="1">
+      <w:start w:val="1"/>
+      <w:numFmt w:val="decimal"/>
+      <w:lvlText w:val="%4."/>
+      <w:lvlJc w:val="left"/>
+      <w:pPr>
+        <w:ind w:left="2520" w:hanging="360"/>
+      </w:pPr>
+    </w:lvl>
+    <w:lvl w:ilvl="4" w:tplc="0C090019" w:tentative="1">
+      <w:start w:val="1"/>
+      <w:numFmt w:val="lowerLetter"/>
+      <w:lvlText w:val="%5."/>
+      <w:lvlJc w:val="left"/>
+      <w:pPr>
+        <w:ind w:left="3240" w:hanging="360"/>
+      </w:pPr>
+    </w:lvl>
+    <w:lvl w:ilvl="5" w:tplc="0C09001B" w:tentative="1">
+      <w:start w:val="1"/>
+      <w:numFmt w:val="lowerRoman"/>
+      <w:lvlText w:val="%6."/>
+      <w:lvlJc w:val="right"/>
+      <w:pPr>
+        <w:ind w:left="3960" w:hanging="180"/>
+      </w:pPr>
+    </w:lvl>
+    <w:lvl w:ilvl="6" w:tplc="0C09000F" w:tentative="1">
+      <w:start w:val="1"/>
+      <w:numFmt w:val="decimal"/>
+      <w:lvlText w:val="%7."/>
+      <w:lvlJc w:val="left"/>
+      <w:pPr>
+        <w:ind w:left="4680" w:hanging="360"/>
+      </w:pPr>
+    </w:lvl>
+    <w:lvl w:ilvl="7" w:tplc="0C090019" w:tentative="1">
+      <w:start w:val="1"/>
+      <w:numFmt w:val="lowerLetter"/>
+      <w:lvlText w:val="%8."/>
+      <w:lvlJc w:val="left"/>
+      <w:pPr>
+        <w:ind w:left="5400" w:hanging="360"/>
+      </w:pPr>
+    </w:lvl>
+    <w:lvl w:ilvl="8" w:tplc="0C09001B" w:tentative="1">
+      <w:start w:val="1"/>
+      <w:numFmt w:val="lowerRoman"/>
+      <w:lvlText w:val="%9."/>
+      <w:lvlJc w:val="right"/>
+      <w:pPr>
+        <w:ind w:left="6120" w:hanging="180"/>
+      </w:pPr>
+    </w:lvl>
+  </w:abstractNum>
+  <w:abstractNum w:abstractNumId="3" w15:restartNumberingAfterBreak="0">
+    <w:nsid w:val="612E6F7E"/>
+    <w:multiLevelType w:val="hybridMultilevel"/>
+    <w:tmpl w:val="E0AA8142"/>
+    <w:lvl w:ilvl="0" w:tplc="0C090011">
+      <w:start w:val="1"/>
+      <w:numFmt w:val="decimal"/>
+      <w:lvlText w:val="%1)"/>
+      <w:lvlJc w:val="left"/>
+      <w:pPr>
+        <w:ind w:left="1800" w:hanging="360"/>
+      </w:pPr>
+      <w:rPr>
+        <w:rFonts w:hint="default"/>
+      </w:rPr>
+    </w:lvl>
+    <w:lvl w:ilvl="1" w:tplc="0C090019">
+      <w:start w:val="1"/>
+      <w:numFmt w:val="lowerLetter"/>
+      <w:lvlText w:val="%2."/>
+      <w:lvlJc w:val="left"/>
+      <w:pPr>
+        <w:ind w:left="2520" w:hanging="360"/>
+      </w:pPr>
+    </w:lvl>
+    <w:lvl w:ilvl="2" w:tplc="0C09001B" w:tentative="1">
+      <w:start w:val="1"/>
+      <w:numFmt w:val="lowerRoman"/>
+      <w:lvlText w:val="%3."/>
+      <w:lvlJc w:val="right"/>
+      <w:pPr>
+        <w:ind w:left="3240" w:hanging="180"/>
+      </w:pPr>
+    </w:lvl>
+    <w:lvl w:ilvl="3" w:tplc="0C09000F" w:tentative="1">
+      <w:start w:val="1"/>
+      <w:numFmt w:val="decimal"/>
+      <w:lvlText w:val="%4."/>
+      <w:lvlJc w:val="left"/>
+      <w:pPr>
+        <w:ind w:left="3960" w:hanging="360"/>
+      </w:pPr>
+    </w:lvl>
+    <w:lvl w:ilvl="4" w:tplc="0C090019" w:tentative="1">
+      <w:start w:val="1"/>
+      <w:numFmt w:val="lowerLetter"/>
+      <w:lvlText w:val="%5."/>
+      <w:lvlJc w:val="left"/>
+      <w:pPr>
+        <w:ind w:left="4680" w:hanging="360"/>
+      </w:pPr>
+    </w:lvl>
+    <w:lvl w:ilvl="5" w:tplc="0C09001B" w:tentative="1">
+      <w:start w:val="1"/>
+      <w:numFmt w:val="lowerRoman"/>
+      <w:lvlText w:val="%6."/>
+      <w:lvlJc w:val="right"/>
+      <w:pPr>
+        <w:ind w:left="5400" w:hanging="180"/>
+      </w:pPr>
+    </w:lvl>
+    <w:lvl w:ilvl="6" w:tplc="0C09000F" w:tentative="1">
+      <w:start w:val="1"/>
+      <w:numFmt w:val="decimal"/>
+      <w:lvlText w:val="%7."/>
+      <w:lvlJc w:val="left"/>
+      <w:pPr>
+        <w:ind w:left="6120" w:hanging="360"/>
+      </w:pPr>
+    </w:lvl>
+    <w:lvl w:ilvl="7" w:tplc="0C090019" w:tentative="1">
+      <w:start w:val="1"/>
+      <w:numFmt w:val="lowerLetter"/>
+      <w:lvlText w:val="%8."/>
+      <w:lvlJc w:val="left"/>
+      <w:pPr>
+        <w:ind w:left="6840" w:hanging="360"/>
+      </w:pPr>
+    </w:lvl>
+    <w:lvl w:ilvl="8" w:tplc="0C09001B" w:tentative="1">
+      <w:start w:val="1"/>
+      <w:numFmt w:val="lowerRoman"/>
+      <w:lvlText w:val="%9."/>
+      <w:lvlJc w:val="right"/>
+      <w:pPr>
+        <w:ind w:left="7560" w:hanging="180"/>
+      </w:pPr>
+    </w:lvl>
+  </w:abstractNum>
+  <w:abstractNum w:abstractNumId="4" w15:restartNumberingAfterBreak="0">
+    <w:nsid w:val="7B4A143C"/>
+    <w:multiLevelType w:val="hybridMultilevel"/>
+    <w:tmpl w:val="9EA487DC"/>
+    <w:lvl w:ilvl="0" w:tplc="8828EA00">
+      <w:start w:val="1"/>
+      <w:numFmt w:val="decimal"/>
+      <w:lvlText w:val="%1)"/>
+      <w:lvlJc w:val="left"/>
+      <w:pPr>
+        <w:ind w:left="1800" w:hanging="360"/>
+      </w:pPr>
+      <w:rPr>
+        <w:rFonts w:hint="default"/>
+      </w:rPr>
+    </w:lvl>
+    <w:lvl w:ilvl="1" w:tplc="0C090019" w:tentative="1">
+      <w:start w:val="1"/>
+      <w:numFmt w:val="lowerLetter"/>
+      <w:lvlText w:val="%2."/>
+      <w:lvlJc w:val="left"/>
+      <w:pPr>
+        <w:ind w:left="2520" w:hanging="360"/>
+      </w:pPr>
+    </w:lvl>
+    <w:lvl w:ilvl="2" w:tplc="0C09001B" w:tentative="1">
+      <w:start w:val="1"/>
+      <w:numFmt w:val="lowerRoman"/>
+      <w:lvlText w:val="%3."/>
+      <w:lvlJc w:val="right"/>
+      <w:pPr>
+        <w:ind w:left="3240" w:hanging="180"/>
+      </w:pPr>
+    </w:lvl>
+    <w:lvl w:ilvl="3" w:tplc="0C09000F" w:tentative="1">
+      <w:start w:val="1"/>
+      <w:numFmt w:val="decimal"/>
+      <w:lvlText w:val="%4."/>
+      <w:lvlJc w:val="left"/>
+      <w:pPr>
+        <w:ind w:left="3960" w:hanging="360"/>
+      </w:pPr>
+    </w:lvl>
+    <w:lvl w:ilvl="4" w:tplc="0C090019" w:tentative="1">
+      <w:start w:val="1"/>
+      <w:numFmt w:val="lowerLetter"/>
+      <w:lvlText w:val="%5."/>
+      <w:lvlJc w:val="left"/>
+      <w:pPr>
+        <w:ind w:left="4680" w:hanging="360"/>
+      </w:pPr>
+    </w:lvl>
+    <w:lvl w:ilvl="5" w:tplc="0C09001B" w:tentative="1">
+      <w:start w:val="1"/>
+      <w:numFmt w:val="lowerRoman"/>
+      <w:lvlText w:val="%6."/>
+      <w:lvlJc w:val="right"/>
+      <w:pPr>
+        <w:ind w:left="5400" w:hanging="180"/>
+      </w:pPr>
+    </w:lvl>
+    <w:lvl w:ilvl="6" w:tplc="0C09000F" w:tentative="1">
+      <w:start w:val="1"/>
+      <w:numFmt w:val="decimal"/>
+      <w:lvlText w:val="%7."/>
+      <w:lvlJc w:val="left"/>
+      <w:pPr>
+        <w:ind w:left="6120" w:hanging="360"/>
+      </w:pPr>
+    </w:lvl>
+    <w:lvl w:ilvl="7" w:tplc="0C090019" w:tentative="1">
+      <w:start w:val="1"/>
+      <w:numFmt w:val="lowerLetter"/>
+      <w:lvlText w:val="%8."/>
+      <w:lvlJc w:val="left"/>
+      <w:pPr>
+        <w:ind w:left="6840" w:hanging="360"/>
+      </w:pPr>
+    </w:lvl>
+    <w:lvl w:ilvl="8" w:tplc="0C09001B" w:tentative="1">
+      <w:start w:val="1"/>
+      <w:numFmt w:val="lowerRoman"/>
+      <w:lvlText w:val="%9."/>
+      <w:lvlJc w:val="right"/>
+      <w:pPr>
+        <w:ind w:left="7560" w:hanging="180"/>
+      </w:pPr>
+    </w:lvl>
+  </w:abstractNum>
+  <w:num w:numId="1" w16cid:durableId="209848731">
+    <w:abstractNumId w:val="0"/>
+  </w:num>
+  <w:num w:numId="2" w16cid:durableId="1353416424">
+    <w:abstractNumId w:val="2"/>
+  </w:num>
+  <w:num w:numId="3" w16cid:durableId="1070155739">
+    <w:abstractNumId w:val="1"/>
+  </w:num>
+  <w:num w:numId="4" w16cid:durableId="508519872">
+    <w:abstractNumId w:val="4"/>
+  </w:num>
+  <w:num w:numId="5" w16cid:durableId="1240289184">
+    <w:abstractNumId w:val="3"/>
+  </w:num>
+</w:numbering>
 </file>
 
 <file path=word/styles.xml><?xml version="1.0" encoding="utf-8"?>

</xml_diff>